<commit_message>
fix template alt and add q college
</commit_message>
<xml_diff>
--- a/template_alt.docx
+++ b/template_alt.docx
@@ -79,6 +79,34 @@
           <w:lang w:val="kk-KZ"/>
         </w:rPr>
       </w:pPr>
+    </w:p>
+    <w:p>
+      <w:pPr>
+        <w:shd w:val="clear" w:color="auto" w:fill="FFFFFF"/>
+        <w:spacing w:after="0"/>
+        <w:jc w:val="center"/>
+        <w:textAlignment w:val="baseline"/>
+        <w:outlineLvl w:val="2"/>
+        <w:rPr>
+          <w:rFonts w:eastAsia="Calibri" w:cs="Times New Roman"/>
+          <w:b/>
+          <w:color w:val="002060"/>
+          <w:sz w:val="24"/>
+          <w:szCs w:val="24"/>
+          <w:lang w:val="kk-KZ"/>
+        </w:rPr>
+      </w:pPr>
+      <w:r>
+        <w:rPr>
+          <w:rFonts w:eastAsia="Calibri" w:cs="Times New Roman"/>
+          <w:b/>
+          <w:color w:val="002060"/>
+          <w:sz w:val="24"/>
+          <w:szCs w:val="24"/>
+          <w:lang w:val="kk-KZ"/>
+        </w:rPr>
+        <w:t xml:space="preserve">АЛМАТЫ ЛОГИСТИКА ЖӘНЕ КӨЛІК АКАДЕМИЯСЫНЫҢ КОЛЛЕДЖІ </w:t>
+      </w:r>
     </w:p>
     <w:p>
       <w:pPr>
@@ -2274,7 +2302,16 @@
                 <w:sz w:val="24"/>
                 <w:szCs w:val="24"/>
               </w:rPr>
-              <w:t xml:space="preserve"> 1.</w:t>
+              <w:t xml:space="preserve"> </w:t>
+            </w:r>
+            <w:r>
+              <w:rPr>
+                <w:rFonts w:cs="Times New Roman"/>
+                <w:sz w:val="24"/>
+                <w:szCs w:val="24"/>
+              </w:rPr>
+              <w:lastRenderedPageBreak/>
+              <w:t>1.</w:t>
             </w:r>
             <w:r>
               <w:rPr>
@@ -2301,7 +2338,6 @@
                 <w:sz w:val="24"/>
                 <w:szCs w:val="24"/>
               </w:rPr>
-              <w:lastRenderedPageBreak/>
               <w:t>кезең</w:t>
             </w:r>
             <w:proofErr w:type="spellEnd"/>
@@ -4439,6 +4475,7 @@
                 <w:szCs w:val="24"/>
                 <w:lang w:eastAsia="ru-RU"/>
               </w:rPr>
+              <w:lastRenderedPageBreak/>
               <w:t>способов</w:t>
             </w:r>
           </w:p>
@@ -4463,7 +4500,6 @@
                 <w:szCs w:val="24"/>
                 <w:lang w:eastAsia="ru-RU"/>
               </w:rPr>
-              <w:lastRenderedPageBreak/>
               <w:t>деятельности</w:t>
             </w:r>
             <w:r>

</xml_diff>